<commit_message>
feature: Change the homework script to start with 'result'=output business JSON, use 'data' for the host list and 'result' for each business result. Update the built-in inspection script, report template, and instructions together
</commit_message>
<xml_diff>
--- a/server/apps/workflow_orchestration/assets/templates/health-inspection-example.docx
+++ b/server/apps/workflow_orchestration/assets/templates/health-inspection-example.docx
@@ -510,7 +510,7 @@
           </w:tcPr>
           <w:p>
             <w:r>
-              <w:t>{%tr for r in results if r.status != 'SUCCESS' %}</w:t>
+              <w:t>{%tr for r in data if r.status != 'SUCCESS' %}</w:t>
             </w:r>
           </w:p>
         </w:tc>
@@ -628,7 +628,7 @@
                 <w:color w:val="1C2833"/>
                 <w:sz w:val="16"/>
               </w:rPr>
-              <w:t>{{ r.data.critical_count }}</w:t>
+              <w:t>{{ r.result.critical_count }}</w:t>
             </w:r>
           </w:p>
         </w:tc>
@@ -648,7 +648,7 @@
                 <w:color w:val="1C2833"/>
                 <w:sz w:val="16"/>
               </w:rPr>
-              <w:t>{{ r.data.warning_count }}</w:t>
+              <w:t>{{ r.result.warning_count }}</w:t>
             </w:r>
           </w:p>
         </w:tc>
@@ -668,7 +668,7 @@
                 <w:color w:val="1C2833"/>
                 <w:sz w:val="16"/>
               </w:rPr>
-              <w:t>{{ r.data.normal_count }}</w:t>
+              <w:t>{{ r.result.normal_count }}</w:t>
             </w:r>
           </w:p>
         </w:tc>
@@ -749,7 +749,7 @@
           </w:tcPr>
           <w:p>
             <w:r>
-              <w:t>{%tr for r in results if r.status == 'SUCCESS' and r.data.critical_count &gt; 0 %}</w:t>
+              <w:t>{%tr for r in data if r.status == 'SUCCESS' and r.result.critical_count &gt; 0 %}</w:t>
             </w:r>
           </w:p>
         </w:tc>
@@ -867,7 +867,7 @@
                 <w:color w:val="1C2833"/>
                 <w:sz w:val="16"/>
               </w:rPr>
-              <w:t>{{ r.data.critical_count }}</w:t>
+              <w:t>{{ r.result.critical_count }}</w:t>
             </w:r>
           </w:p>
         </w:tc>
@@ -887,7 +887,7 @@
                 <w:color w:val="1C2833"/>
                 <w:sz w:val="16"/>
               </w:rPr>
-              <w:t>{{ r.data.warning_count }}</w:t>
+              <w:t>{{ r.result.warning_count }}</w:t>
             </w:r>
           </w:p>
         </w:tc>
@@ -907,7 +907,7 @@
                 <w:color w:val="1C2833"/>
                 <w:sz w:val="16"/>
               </w:rPr>
-              <w:t>{{ r.data.normal_count }}</w:t>
+              <w:t>{{ r.result.normal_count }}</w:t>
             </w:r>
           </w:p>
         </w:tc>
@@ -988,7 +988,7 @@
           </w:tcPr>
           <w:p>
             <w:r>
-              <w:t>{%tr for r in results if r.status == 'SUCCESS' and r.data.critical_count == 0 and r.data.warning_count &gt; 0 %}</w:t>
+              <w:t>{%tr for r in data if r.status == 'SUCCESS' and r.result.critical_count == 0 and r.result.warning_count &gt; 0 %}</w:t>
             </w:r>
           </w:p>
         </w:tc>
@@ -1106,7 +1106,7 @@
                 <w:color w:val="1C2833"/>
                 <w:sz w:val="16"/>
               </w:rPr>
-              <w:t>{{ r.data.critical_count }}</w:t>
+              <w:t>{{ r.result.critical_count }}</w:t>
             </w:r>
           </w:p>
         </w:tc>
@@ -1126,7 +1126,7 @@
                 <w:color w:val="1C2833"/>
                 <w:sz w:val="16"/>
               </w:rPr>
-              <w:t>{{ r.data.warning_count }}</w:t>
+              <w:t>{{ r.result.warning_count }}</w:t>
             </w:r>
           </w:p>
         </w:tc>
@@ -1146,7 +1146,7 @@
                 <w:color w:val="1C2833"/>
                 <w:sz w:val="16"/>
               </w:rPr>
-              <w:t>{{ r.data.normal_count }}</w:t>
+              <w:t>{{ r.result.normal_count }}</w:t>
             </w:r>
           </w:p>
         </w:tc>
@@ -1227,7 +1227,7 @@
           </w:tcPr>
           <w:p>
             <w:r>
-              <w:t>{%tr for r in results if r.status == 'SUCCESS' and r.data.critical_count == 0 and r.data.warning_count == 0 %}</w:t>
+              <w:t>{%tr for r in data if r.status == 'SUCCESS' and r.result.critical_count == 0 and r.result.warning_count == 0 %}</w:t>
             </w:r>
           </w:p>
         </w:tc>
@@ -1345,7 +1345,7 @@
                 <w:color w:val="1C2833"/>
                 <w:sz w:val="16"/>
               </w:rPr>
-              <w:t>{{ r.data.critical_count }}</w:t>
+              <w:t>{{ r.result.critical_count }}</w:t>
             </w:r>
           </w:p>
         </w:tc>
@@ -1365,7 +1365,7 @@
                 <w:color w:val="1C2833"/>
                 <w:sz w:val="16"/>
               </w:rPr>
-              <w:t>{{ r.data.warning_count }}</w:t>
+              <w:t>{{ r.result.warning_count }}</w:t>
             </w:r>
           </w:p>
         </w:tc>
@@ -1385,7 +1385,7 @@
                 <w:color w:val="1C2833"/>
                 <w:sz w:val="16"/>
               </w:rPr>
-              <w:t>{{ r.data.normal_count }}</w:t>
+              <w:t>{{ r.result.normal_count }}</w:t>
             </w:r>
           </w:p>
         </w:tc>
@@ -2645,7 +2645,7 @@
           </w:tcPr>
           <w:p>
             <w:r>
-              <w:t>{%tr for r in results %}</w:t>
+              <w:t>{%tr for r in data %}</w:t>
             </w:r>
           </w:p>
         </w:tc>
@@ -2681,7 +2681,7 @@
           </w:tcPr>
           <w:p>
             <w:r>
-              <w:t>{%tr for m in r.data.critical|default([]) %}</w:t>
+              <w:t>{%tr for m in r.result.critical|default([]) %}</w:t>
             </w:r>
           </w:p>
         </w:tc>
@@ -3041,7 +3041,7 @@
           </w:tcPr>
           <w:p>
             <w:r>
-              <w:t>{%tr for r in results %}</w:t>
+              <w:t>{%tr for r in data %}</w:t>
             </w:r>
           </w:p>
         </w:tc>
@@ -3077,7 +3077,7 @@
           </w:tcPr>
           <w:p>
             <w:r>
-              <w:t>{%tr for m in r.data.warning|default([]) %}</w:t>
+              <w:t>{%tr for m in r.result.warning|default([]) %}</w:t>
             </w:r>
           </w:p>
         </w:tc>
@@ -3464,7 +3464,7 @@
           </w:tcPr>
           <w:p>
             <w:r>
-              <w:t>{%tr for r in results if r.status != 'SUCCESS' %}</w:t>
+              <w:t>{%tr for r in data if r.status != 'SUCCESS' %}</w:t>
             </w:r>
           </w:p>
         </w:tc>
@@ -3671,7 +3671,7 @@
           </w:tcPr>
           <w:p>
             <w:r>
-              <w:t>{%tr for r in results if r.status == 'SUCCESS' and r.data.critical_count &gt; 0 %}</w:t>
+              <w:t>{%tr for r in data if r.status == 'SUCCESS' and r.result.critical_count &gt; 0 %}</w:t>
             </w:r>
           </w:p>
         </w:tc>
@@ -3713,7 +3713,7 @@
           </w:tcPr>
           <w:p>
             <w:r>
-              <w:t>{%tr for m in r.data.metrics %}</w:t>
+              <w:t>{%tr for m in r.result.metrics %}</w:t>
             </w:r>
           </w:p>
         </w:tc>
@@ -3961,7 +3961,7 @@
           </w:tcPr>
           <w:p>
             <w:r>
-              <w:t>{%tr for r in results if r.status == 'SUCCESS' and r.data.critical_count == 0 and r.data.warning_count &gt; 0 %}</w:t>
+              <w:t>{%tr for r in data if r.status == 'SUCCESS' and r.result.critical_count == 0 and r.result.warning_count &gt; 0 %}</w:t>
             </w:r>
           </w:p>
         </w:tc>
@@ -4003,7 +4003,7 @@
           </w:tcPr>
           <w:p>
             <w:r>
-              <w:t>{%tr for m in r.data.metrics %}</w:t>
+              <w:t>{%tr for m in r.result.metrics %}</w:t>
             </w:r>
           </w:p>
         </w:tc>
@@ -4251,7 +4251,7 @@
           </w:tcPr>
           <w:p>
             <w:r>
-              <w:t>{%tr for r in results if r.status == 'SUCCESS' and r.data.critical_count == 0 and r.data.warning_count == 0 %}</w:t>
+              <w:t>{%tr for r in data if r.status == 'SUCCESS' and r.result.critical_count == 0 and r.result.warning_count == 0 %}</w:t>
             </w:r>
           </w:p>
         </w:tc>
@@ -4293,7 +4293,7 @@
           </w:tcPr>
           <w:p>
             <w:r>
-              <w:t>{%tr for m in r.data.metrics %}</w:t>
+              <w:t>{%tr for m in r.result.metrics %}</w:t>
             </w:r>
           </w:p>
         </w:tc>

</xml_diff>